<commit_message>
perbaikan project dan teknisi yang sudah selesai tetap muncul sampai H+1 baru hilang, perbaikan sw.js agar mendukung realtime update
</commit_message>
<xml_diff>
--- a/public/report-templates/Template_BNI.docx
+++ b/public/report-templates/Template_BNI.docx
@@ -541,10 +541,10 @@
         <w:tblLook w:val="04A0" w:firstRow="1" w:lastRow="0" w:firstColumn="1" w:lastColumn="0" w:noHBand="0" w:noVBand="1"/>
       </w:tblPr>
       <w:tblGrid>
-        <w:gridCol w:w="704"/>
-        <w:gridCol w:w="5528"/>
-        <w:gridCol w:w="1418"/>
-        <w:gridCol w:w="1367"/>
+        <w:gridCol w:w="695"/>
+        <w:gridCol w:w="5302"/>
+        <w:gridCol w:w="1387"/>
+        <w:gridCol w:w="1967"/>
       </w:tblGrid>
       <w:tr>
         <w:tc>
@@ -702,6 +702,14 @@
                 <w:szCs w:val="24"/>
               </w:rPr>
             </w:pPr>
+            <w:r>
+              <w:rPr>
+                <w:rFonts w:ascii="Times New Roman" w:hAnsi="Times New Roman" w:cs="Times New Roman"/>
+                <w:sz w:val="24"/>
+                <w:szCs w:val="24"/>
+              </w:rPr>
+              <w:t>{komp01_nama}</w:t>
+            </w:r>
           </w:p>
         </w:tc>
         <w:tc>
@@ -736,6 +744,14 @@
                 <w:szCs w:val="24"/>
               </w:rPr>
             </w:pPr>
+            <w:r>
+              <w:rPr>
+                <w:rFonts w:ascii="Times New Roman" w:hAnsi="Times New Roman" w:cs="Times New Roman"/>
+                <w:sz w:val="24"/>
+                <w:szCs w:val="24"/>
+              </w:rPr>
+              <w:t>{komp01_satuan}</w:t>
+            </w:r>
           </w:p>
         </w:tc>
       </w:tr>
@@ -779,6 +795,14 @@
                 <w:szCs w:val="24"/>
               </w:rPr>
             </w:pPr>
+            <w:r>
+              <w:rPr>
+                <w:rFonts w:ascii="Times New Roman" w:hAnsi="Times New Roman" w:cs="Times New Roman"/>
+                <w:sz w:val="24"/>
+                <w:szCs w:val="24"/>
+              </w:rPr>
+              <w:t>{komp02_nama}</w:t>
+            </w:r>
           </w:p>
         </w:tc>
         <w:tc>
@@ -813,6 +837,14 @@
                 <w:szCs w:val="24"/>
               </w:rPr>
             </w:pPr>
+            <w:r>
+              <w:rPr>
+                <w:rFonts w:ascii="Times New Roman" w:hAnsi="Times New Roman" w:cs="Times New Roman"/>
+                <w:sz w:val="24"/>
+                <w:szCs w:val="24"/>
+              </w:rPr>
+              <w:t>{komp02_satuan}</w:t>
+            </w:r>
           </w:p>
         </w:tc>
       </w:tr>
@@ -856,6 +888,14 @@
                 <w:szCs w:val="24"/>
               </w:rPr>
             </w:pPr>
+            <w:r>
+              <w:rPr>
+                <w:rFonts w:ascii="Times New Roman" w:hAnsi="Times New Roman" w:cs="Times New Roman"/>
+                <w:sz w:val="24"/>
+                <w:szCs w:val="24"/>
+              </w:rPr>
+              <w:t>{komp03_nama}</w:t>
+            </w:r>
           </w:p>
         </w:tc>
         <w:tc>
@@ -890,6 +930,14 @@
                 <w:szCs w:val="24"/>
               </w:rPr>
             </w:pPr>
+            <w:r>
+              <w:rPr>
+                <w:rFonts w:ascii="Times New Roman" w:hAnsi="Times New Roman" w:cs="Times New Roman"/>
+                <w:sz w:val="24"/>
+                <w:szCs w:val="24"/>
+              </w:rPr>
+              <w:t>{komp03_satuan}</w:t>
+            </w:r>
           </w:p>
         </w:tc>
       </w:tr>
@@ -933,6 +981,14 @@
                 <w:szCs w:val="24"/>
               </w:rPr>
             </w:pPr>
+            <w:r>
+              <w:rPr>
+                <w:rFonts w:ascii="Times New Roman" w:hAnsi="Times New Roman" w:cs="Times New Roman"/>
+                <w:sz w:val="24"/>
+                <w:szCs w:val="24"/>
+              </w:rPr>
+              <w:t>{komp04_nama}</w:t>
+            </w:r>
           </w:p>
         </w:tc>
         <w:tc>
@@ -967,6 +1023,14 @@
                 <w:szCs w:val="24"/>
               </w:rPr>
             </w:pPr>
+            <w:r>
+              <w:rPr>
+                <w:rFonts w:ascii="Times New Roman" w:hAnsi="Times New Roman" w:cs="Times New Roman"/>
+                <w:sz w:val="24"/>
+                <w:szCs w:val="24"/>
+              </w:rPr>
+              <w:t>{komp04_satuan}</w:t>
+            </w:r>
           </w:p>
         </w:tc>
       </w:tr>
@@ -1010,6 +1074,14 @@
                 <w:szCs w:val="24"/>
               </w:rPr>
             </w:pPr>
+            <w:r>
+              <w:rPr>
+                <w:rFonts w:ascii="Times New Roman" w:hAnsi="Times New Roman" w:cs="Times New Roman"/>
+                <w:sz w:val="24"/>
+                <w:szCs w:val="24"/>
+              </w:rPr>
+              <w:t>{komp05_nama}</w:t>
+            </w:r>
           </w:p>
         </w:tc>
         <w:tc>
@@ -1044,6 +1116,14 @@
                 <w:szCs w:val="24"/>
               </w:rPr>
             </w:pPr>
+            <w:r>
+              <w:rPr>
+                <w:rFonts w:ascii="Times New Roman" w:hAnsi="Times New Roman" w:cs="Times New Roman"/>
+                <w:sz w:val="24"/>
+                <w:szCs w:val="24"/>
+              </w:rPr>
+              <w:t>{komp05_satuan}</w:t>
+            </w:r>
           </w:p>
         </w:tc>
       </w:tr>
@@ -1087,6 +1167,14 @@
                 <w:szCs w:val="24"/>
               </w:rPr>
             </w:pPr>
+            <w:r>
+              <w:rPr>
+                <w:rFonts w:ascii="Times New Roman" w:hAnsi="Times New Roman" w:cs="Times New Roman"/>
+                <w:sz w:val="24"/>
+                <w:szCs w:val="24"/>
+              </w:rPr>
+              <w:t>{komp06_nama}</w:t>
+            </w:r>
           </w:p>
         </w:tc>
         <w:tc>
@@ -1121,6 +1209,14 @@
                 <w:szCs w:val="24"/>
               </w:rPr>
             </w:pPr>
+            <w:r>
+              <w:rPr>
+                <w:rFonts w:ascii="Times New Roman" w:hAnsi="Times New Roman" w:cs="Times New Roman"/>
+                <w:sz w:val="24"/>
+                <w:szCs w:val="24"/>
+              </w:rPr>
+              <w:t>{komp06_satuan}</w:t>
+            </w:r>
           </w:p>
         </w:tc>
       </w:tr>
@@ -1164,6 +1260,14 @@
                 <w:szCs w:val="24"/>
               </w:rPr>
             </w:pPr>
+            <w:r>
+              <w:rPr>
+                <w:rFonts w:ascii="Times New Roman" w:hAnsi="Times New Roman" w:cs="Times New Roman"/>
+                <w:sz w:val="24"/>
+                <w:szCs w:val="24"/>
+              </w:rPr>
+              <w:t>{komp07_nama}</w:t>
+            </w:r>
           </w:p>
         </w:tc>
         <w:tc>
@@ -1198,6 +1302,14 @@
                 <w:szCs w:val="24"/>
               </w:rPr>
             </w:pPr>
+            <w:r>
+              <w:rPr>
+                <w:rFonts w:ascii="Times New Roman" w:hAnsi="Times New Roman" w:cs="Times New Roman"/>
+                <w:sz w:val="24"/>
+                <w:szCs w:val="24"/>
+              </w:rPr>
+              <w:t>{komp07_satuan}</w:t>
+            </w:r>
           </w:p>
         </w:tc>
       </w:tr>
@@ -1241,6 +1353,14 @@
                 <w:szCs w:val="24"/>
               </w:rPr>
             </w:pPr>
+            <w:r>
+              <w:rPr>
+                <w:rFonts w:ascii="Times New Roman" w:hAnsi="Times New Roman" w:cs="Times New Roman"/>
+                <w:sz w:val="24"/>
+                <w:szCs w:val="24"/>
+              </w:rPr>
+              <w:t>{komp08_nama}</w:t>
+            </w:r>
           </w:p>
         </w:tc>
         <w:tc>
@@ -1275,6 +1395,14 @@
                 <w:szCs w:val="24"/>
               </w:rPr>
             </w:pPr>
+            <w:r>
+              <w:rPr>
+                <w:rFonts w:ascii="Times New Roman" w:hAnsi="Times New Roman" w:cs="Times New Roman"/>
+                <w:sz w:val="24"/>
+                <w:szCs w:val="24"/>
+              </w:rPr>
+              <w:t>{komp08_satuan}</w:t>
+            </w:r>
           </w:p>
         </w:tc>
       </w:tr>
@@ -1318,6 +1446,14 @@
                 <w:szCs w:val="24"/>
               </w:rPr>
             </w:pPr>
+            <w:r>
+              <w:rPr>
+                <w:rFonts w:ascii="Times New Roman" w:hAnsi="Times New Roman" w:cs="Times New Roman"/>
+                <w:sz w:val="24"/>
+                <w:szCs w:val="24"/>
+              </w:rPr>
+              <w:t>{komp09_nama}</w:t>
+            </w:r>
           </w:p>
         </w:tc>
         <w:tc>
@@ -1352,6 +1488,14 @@
                 <w:szCs w:val="24"/>
               </w:rPr>
             </w:pPr>
+            <w:r>
+              <w:rPr>
+                <w:rFonts w:ascii="Times New Roman" w:hAnsi="Times New Roman" w:cs="Times New Roman"/>
+                <w:sz w:val="24"/>
+                <w:szCs w:val="24"/>
+              </w:rPr>
+              <w:t>{komp09_satuan}</w:t>
+            </w:r>
           </w:p>
         </w:tc>
       </w:tr>
@@ -1395,6 +1539,14 @@
                 <w:szCs w:val="24"/>
               </w:rPr>
             </w:pPr>
+            <w:r>
+              <w:rPr>
+                <w:rFonts w:ascii="Times New Roman" w:hAnsi="Times New Roman" w:cs="Times New Roman"/>
+                <w:sz w:val="24"/>
+                <w:szCs w:val="24"/>
+              </w:rPr>
+              <w:t>{komp10_nama}</w:t>
+            </w:r>
           </w:p>
         </w:tc>
         <w:tc>
@@ -1429,6 +1581,14 @@
                 <w:szCs w:val="24"/>
               </w:rPr>
             </w:pPr>
+            <w:r>
+              <w:rPr>
+                <w:rFonts w:ascii="Times New Roman" w:hAnsi="Times New Roman" w:cs="Times New Roman"/>
+                <w:sz w:val="24"/>
+                <w:szCs w:val="24"/>
+              </w:rPr>
+              <w:t>{komp10_satuan}</w:t>
+            </w:r>
           </w:p>
         </w:tc>
       </w:tr>
@@ -1472,6 +1632,14 @@
                 <w:szCs w:val="24"/>
               </w:rPr>
             </w:pPr>
+            <w:r>
+              <w:rPr>
+                <w:rFonts w:ascii="Times New Roman" w:hAnsi="Times New Roman" w:cs="Times New Roman"/>
+                <w:sz w:val="24"/>
+                <w:szCs w:val="24"/>
+              </w:rPr>
+              <w:t>{komp11_nama}</w:t>
+            </w:r>
           </w:p>
         </w:tc>
         <w:tc>
@@ -1506,6 +1674,14 @@
                 <w:szCs w:val="24"/>
               </w:rPr>
             </w:pPr>
+            <w:r>
+              <w:rPr>
+                <w:rFonts w:ascii="Times New Roman" w:hAnsi="Times New Roman" w:cs="Times New Roman"/>
+                <w:sz w:val="24"/>
+                <w:szCs w:val="24"/>
+              </w:rPr>
+              <w:t>{komp11_satuan}</w:t>
+            </w:r>
           </w:p>
         </w:tc>
       </w:tr>
@@ -1549,6 +1725,14 @@
                 <w:szCs w:val="24"/>
               </w:rPr>
             </w:pPr>
+            <w:r>
+              <w:rPr>
+                <w:rFonts w:ascii="Times New Roman" w:hAnsi="Times New Roman" w:cs="Times New Roman"/>
+                <w:sz w:val="24"/>
+                <w:szCs w:val="24"/>
+              </w:rPr>
+              <w:t>{komp12_nama}</w:t>
+            </w:r>
           </w:p>
         </w:tc>
         <w:tc>
@@ -1583,6 +1767,14 @@
                 <w:szCs w:val="24"/>
               </w:rPr>
             </w:pPr>
+            <w:r>
+              <w:rPr>
+                <w:rFonts w:ascii="Times New Roman" w:hAnsi="Times New Roman" w:cs="Times New Roman"/>
+                <w:sz w:val="24"/>
+                <w:szCs w:val="24"/>
+              </w:rPr>
+              <w:t>{komp12_satuan}</w:t>
+            </w:r>
           </w:p>
         </w:tc>
       </w:tr>
@@ -1615,17 +1807,24 @@
         <w:tc>
           <w:tcPr>
             <w:tcW w:w="5528" w:type="dxa"/>
-            <w:vAlign w:val="center"/>
-          </w:tcPr>
-          <w:p>
-            <w:pPr>
-              <w:spacing w:beforeLines="20" w:before="48" w:afterLines="20" w:after="48"/>
-              <w:rPr>
-                <w:rFonts w:ascii="Times New Roman" w:eastAsia="Times New Roman" w:hAnsi="Times New Roman" w:cs="Times New Roman"/>
-                <w:sz w:val="24"/>
-                <w:szCs w:val="24"/>
-              </w:rPr>
-            </w:pPr>
+          </w:tcPr>
+          <w:p>
+            <w:pPr>
+              <w:spacing w:beforeLines="20" w:before="48" w:afterLines="20" w:after="48"/>
+              <w:rPr>
+                <w:rFonts w:ascii="Times New Roman" w:eastAsia="Times New Roman" w:hAnsi="Times New Roman" w:cs="Times New Roman"/>
+                <w:sz w:val="24"/>
+                <w:szCs w:val="24"/>
+              </w:rPr>
+            </w:pPr>
+            <w:r>
+              <w:rPr>
+                <w:rFonts w:ascii="Times New Roman" w:hAnsi="Times New Roman" w:cs="Times New Roman"/>
+                <w:sz w:val="24"/>
+                <w:szCs w:val="24"/>
+              </w:rPr>
+              <w:t>{komp13_nama}</w:t>
+            </w:r>
           </w:p>
         </w:tc>
         <w:tc>
@@ -1659,6 +1858,14 @@
                 <w:szCs w:val="24"/>
               </w:rPr>
             </w:pPr>
+            <w:r>
+              <w:rPr>
+                <w:rFonts w:ascii="Times New Roman" w:hAnsi="Times New Roman" w:cs="Times New Roman"/>
+                <w:sz w:val="24"/>
+                <w:szCs w:val="24"/>
+              </w:rPr>
+              <w:t>{komp13_satuan}</w:t>
+            </w:r>
           </w:p>
         </w:tc>
       </w:tr>
@@ -10985,28 +11192,28 @@
 </file>
 
 <file path=customXml/item1.xml><?xml version="1.0" encoding="utf-8"?>
-<b:Sources xmlns:b="http://schemas.openxmlformats.org/officeDocument/2006/bibliography" xmlns="http://schemas.openxmlformats.org/officeDocument/2006/bibliography" SelectedStyle="\APASixthEditionOfficeOnline.xsl" StyleName="APA" Version="6"/>
-</file>
-
-<file path=customXml/item2.xml><?xml version="1.0" encoding="utf-8"?>
 <go:gDocsCustomXmlDataStorage xmlns:go="http://customooxmlschemas.google.com/" xmlns:r="http://schemas.openxmlformats.org/officeDocument/2006/relationships" uri="GoogleDocsCustomDataVersion2">
   <go:docsCustomData xmlns:go="http://customooxmlschemas.google.com/" roundtripDataSignature="AMtx7mjAEx0BawReXsiu058bTvWTHWOw5Q==">CgMxLjAyDmguY2Y4aG5pZHBjOGt0MghoLmdqZGd4czgAciExaGt3cnRSbzhHNWZNaGFVdG5ldlZkNFZQOExaQ2I3YTY=</go:docsCustomData>
 </go:gDocsCustomXmlDataStorage>
 </file>
 
-<file path=customXml/itemProps1.xml><?xml version="1.0" encoding="utf-8"?>
-<ds:datastoreItem xmlns:ds="http://schemas.openxmlformats.org/officeDocument/2006/customXml" ds:itemID="{E4C1BB43-CAAB-49F4-A97D-16B5292AC504}">
-  <ds:schemaRefs>
-    <ds:schemaRef ds:uri="http://schemas.openxmlformats.org/officeDocument/2006/bibliography"/>
-  </ds:schemaRefs>
-</ds:datastoreItem>
+<file path=customXml/item2.xml><?xml version="1.0" encoding="utf-8"?>
+<b:Sources xmlns:b="http://schemas.openxmlformats.org/officeDocument/2006/bibliography" xmlns="http://schemas.openxmlformats.org/officeDocument/2006/bibliography" SelectedStyle="\APASixthEditionOfficeOnline.xsl" StyleName="APA" Version="6"/>
 </file>
 
-<file path=customXml/itemProps2.xml><?xml version="1.0" encoding="utf-8"?>
+<file path=customXml/itemProps1.xml><?xml version="1.0" encoding="utf-8"?>
 <ds:datastoreItem xmlns:ds="http://schemas.openxmlformats.org/officeDocument/2006/customXml" ds:itemID="{11111111-1234-1234-1234-123412341234}">
   <ds:schemaRefs>
     <ds:schemaRef ds:uri="http://customooxmlschemas.google.com/"/>
     <ds:schemaRef ds:uri="http://schemas.openxmlformats.org/officeDocument/2006/relationships"/>
   </ds:schemaRefs>
 </ds:datastoreItem>
+</file>
+
+<file path=customXml/itemProps2.xml><?xml version="1.0" encoding="utf-8"?>
+<ds:datastoreItem xmlns:ds="http://schemas.openxmlformats.org/officeDocument/2006/customXml" ds:itemID="{E4C1BB43-CAAB-49F4-A97D-16B5292AC504}">
+  <ds:schemaRefs>
+    <ds:schemaRef ds:uri="http://schemas.openxmlformats.org/officeDocument/2006/bibliography"/>
+  </ds:schemaRefs>
+</ds:datastoreItem>
 </file>
</xml_diff>